<commit_message>
working not ended for pdf version of document
</commit_message>
<xml_diff>
--- a/document_templates/PVs/PV.docx
+++ b/document_templates/PVs/PV.docx
@@ -561,9 +561,9 @@
       <w:pPr>
         <w:pStyle w:val="10"/>
         <w:numPr>
-          <w:ilvl w:val="0"/>
-          <w:numId w:val="1"/>
+          <w:numId w:val="0"/>
         </w:numPr>
+        <w:ind w:leftChars="0" w:firstLine="708" w:firstLineChars="0"/>
         <w:rPr>
           <w:rFonts w:hint="default" w:ascii="Times New Roman" w:hAnsi="Times New Roman" w:cs="Times New Roman"/>
           <w:sz w:val="24"/>
@@ -616,523 +616,522 @@
     <w:p>
       <w:pPr>
         <w:pStyle w:val="10"/>
+        <w:numPr>
+          <w:numId w:val="0"/>
+        </w:numPr>
+        <w:ind w:leftChars="0" w:firstLine="708" w:firstLineChars="0"/>
+        <w:rPr>
+          <w:rFonts w:hint="default" w:ascii="Times New Roman" w:hAnsi="Times New Roman" w:cs="Times New Roman"/>
+          <w:sz w:val="24"/>
+          <w:szCs w:val="24"/>
+        </w:rPr>
+      </w:pPr>
+      <w:r>
+        <w:rPr>
+          <w:rFonts w:hint="default" w:ascii="Times New Roman" w:hAnsi="Times New Roman" w:cs="Times New Roman"/>
+          <w:sz w:val="24"/>
+          <w:szCs w:val="24"/>
+        </w:rPr>
+        <w:t>Durée                                                                 </w:t>
+      </w:r>
+      <w:r>
+        <w:rPr>
+          <w:rFonts w:hint="default" w:ascii="Times New Roman" w:hAnsi="Times New Roman" w:cs="Times New Roman"/>
+          <w:sz w:val="24"/>
+          <w:szCs w:val="24"/>
+          <w:lang w:val="en-US"/>
+        </w:rPr>
+        <w:tab/>
+      </w:r>
+      <w:r>
+        <w:rPr>
+          <w:rFonts w:hint="default" w:ascii="Times New Roman" w:hAnsi="Times New Roman" w:cs="Times New Roman"/>
+          <w:sz w:val="24"/>
+          <w:szCs w:val="24"/>
+        </w:rPr>
+        <w:t xml:space="preserve">: </w:t>
+      </w:r>
+      <w:r>
+        <w:rPr>
+          <w:rFonts w:hint="default" w:ascii="Times New Roman" w:hAnsi="Times New Roman" w:cs="Times New Roman"/>
+          <w:sz w:val="24"/>
+          <w:szCs w:val="24"/>
+          <w:lang w:val="en-US"/>
+        </w:rPr>
+        <w:t>${duration}</w:t>
+      </w:r>
+      <w:r>
+        <w:rPr>
+          <w:rFonts w:hint="default" w:ascii="Times New Roman" w:hAnsi="Times New Roman" w:cs="Times New Roman"/>
+          <w:sz w:val="24"/>
+          <w:szCs w:val="24"/>
+        </w:rPr>
+        <w:t xml:space="preserve"> mois   </w:t>
+      </w:r>
+    </w:p>
+    <w:p>
+      <w:pPr>
+        <w:pStyle w:val="10"/>
+        <w:numPr>
+          <w:numId w:val="0"/>
+        </w:numPr>
+        <w:ind w:leftChars="0" w:firstLine="708" w:firstLineChars="0"/>
+        <w:rPr>
+          <w:rFonts w:hint="default" w:ascii="Times New Roman" w:hAnsi="Times New Roman" w:cs="Times New Roman"/>
+          <w:sz w:val="24"/>
+          <w:szCs w:val="24"/>
+        </w:rPr>
+      </w:pPr>
+      <w:r>
+        <w:rPr>
+          <w:rFonts w:hint="default" w:ascii="Times New Roman" w:hAnsi="Times New Roman" w:cs="Times New Roman"/>
+          <w:sz w:val="24"/>
+          <w:szCs w:val="24"/>
+        </w:rPr>
+        <w:t>Périodicité                                                          </w:t>
+      </w:r>
+      <w:r>
+        <w:rPr>
+          <w:rFonts w:hint="default" w:ascii="Times New Roman" w:hAnsi="Times New Roman" w:cs="Times New Roman"/>
+          <w:sz w:val="24"/>
+          <w:szCs w:val="24"/>
+          <w:lang w:val="en-US"/>
+        </w:rPr>
+        <w:tab/>
+      </w:r>
+      <w:r>
+        <w:rPr>
+          <w:rFonts w:hint="default" w:ascii="Times New Roman" w:hAnsi="Times New Roman" w:cs="Times New Roman"/>
+          <w:sz w:val="24"/>
+          <w:szCs w:val="24"/>
+        </w:rPr>
+        <w:t xml:space="preserve">: </w:t>
+      </w:r>
+      <w:r>
+        <w:rPr>
+          <w:rFonts w:hint="default" w:ascii="Times New Roman" w:hAnsi="Times New Roman" w:cs="Times New Roman"/>
+          <w:sz w:val="24"/>
+          <w:szCs w:val="24"/>
+          <w:lang w:val="en-US"/>
+        </w:rPr>
+        <w:t>${periodicity.fr}</w:t>
+      </w:r>
+    </w:p>
+    <w:p>
+      <w:pPr>
+        <w:pStyle w:val="10"/>
+        <w:numPr>
+          <w:numId w:val="0"/>
+        </w:numPr>
+        <w:ind w:leftChars="0" w:firstLine="708" w:firstLineChars="0"/>
+        <w:rPr>
+          <w:rFonts w:hint="default" w:ascii="Times New Roman" w:hAnsi="Times New Roman" w:cs="Times New Roman"/>
+          <w:sz w:val="24"/>
+          <w:szCs w:val="24"/>
+        </w:rPr>
+      </w:pPr>
+      <w:r>
+        <w:rPr>
+          <w:rFonts w:hint="default" w:ascii="Times New Roman" w:hAnsi="Times New Roman" w:cs="Times New Roman"/>
+          <w:sz w:val="24"/>
+          <w:szCs w:val="24"/>
+        </w:rPr>
+        <w:t>Taux d’Intérêt HT                                             </w:t>
+      </w:r>
+      <w:r>
+        <w:rPr>
+          <w:rFonts w:hint="default" w:ascii="Times New Roman" w:hAnsi="Times New Roman" w:cs="Times New Roman"/>
+          <w:sz w:val="24"/>
+          <w:szCs w:val="24"/>
+          <w:lang w:val="en-US"/>
+        </w:rPr>
+        <w:tab/>
+      </w:r>
+      <w:r>
+        <w:rPr>
+          <w:rFonts w:hint="default" w:ascii="Times New Roman" w:hAnsi="Times New Roman" w:cs="Times New Roman"/>
+          <w:sz w:val="24"/>
+          <w:szCs w:val="24"/>
+        </w:rPr>
+        <w:t xml:space="preserve">: </w:t>
+      </w:r>
+      <w:r>
+        <w:rPr>
+          <w:rFonts w:hint="default" w:ascii="Times New Roman" w:hAnsi="Times New Roman" w:cs="Times New Roman"/>
+          <w:sz w:val="24"/>
+          <w:szCs w:val="24"/>
+          <w:lang w:val="en-US"/>
+        </w:rPr>
+        <w:t>${tax_fee_interest_rate}</w:t>
+      </w:r>
+      <w:r>
+        <w:rPr>
+          <w:rFonts w:hint="default" w:ascii="Times New Roman" w:hAnsi="Times New Roman" w:cs="Times New Roman"/>
+          <w:sz w:val="24"/>
+          <w:szCs w:val="24"/>
+        </w:rPr>
+        <w:t>%</w:t>
+      </w:r>
+    </w:p>
+    <w:p>
+      <w:pPr>
+        <w:pStyle w:val="10"/>
+        <w:numPr>
+          <w:numId w:val="0"/>
+        </w:numPr>
+        <w:ind w:leftChars="0" w:firstLine="708" w:firstLineChars="0"/>
+        <w:rPr>
+          <w:rFonts w:hint="default" w:ascii="Times New Roman" w:hAnsi="Times New Roman" w:cs="Times New Roman"/>
+          <w:sz w:val="24"/>
+          <w:szCs w:val="24"/>
+        </w:rPr>
+      </w:pPr>
+      <w:r>
+        <w:rPr>
+          <w:rFonts w:hint="default" w:ascii="Times New Roman" w:hAnsi="Times New Roman" w:cs="Times New Roman"/>
+          <w:sz w:val="24"/>
+          <w:szCs w:val="24"/>
+        </w:rPr>
+        <w:t>TAF                                                                   </w:t>
+      </w:r>
+      <w:r>
+        <w:rPr>
+          <w:rFonts w:hint="default" w:ascii="Times New Roman" w:hAnsi="Times New Roman" w:cs="Times New Roman"/>
+          <w:sz w:val="24"/>
+          <w:szCs w:val="24"/>
+          <w:lang w:val="en-US"/>
+        </w:rPr>
+        <w:tab/>
+      </w:r>
+      <w:r>
+        <w:rPr>
+          <w:rFonts w:hint="default" w:ascii="Times New Roman" w:hAnsi="Times New Roman" w:cs="Times New Roman"/>
+          <w:sz w:val="24"/>
+          <w:szCs w:val="24"/>
+        </w:rPr>
+        <w:t xml:space="preserve">: </w:t>
+      </w:r>
+      <w:r>
+        <w:rPr>
+          <w:rFonts w:hint="default" w:ascii="Times New Roman" w:hAnsi="Times New Roman" w:cs="Times New Roman"/>
+          <w:sz w:val="24"/>
+          <w:szCs w:val="24"/>
+          <w:lang w:val="en-US"/>
+        </w:rPr>
+        <w:t>${taf}</w:t>
+      </w:r>
+      <w:r>
+        <w:rPr>
+          <w:rFonts w:hint="default" w:ascii="Times New Roman" w:hAnsi="Times New Roman" w:cs="Times New Roman"/>
+          <w:sz w:val="24"/>
+          <w:szCs w:val="24"/>
+        </w:rPr>
+        <w:t>%</w:t>
+      </w:r>
+    </w:p>
+    <w:p>
+      <w:pPr>
+        <w:pStyle w:val="10"/>
+        <w:numPr>
+          <w:numId w:val="0"/>
+        </w:numPr>
+        <w:ind w:leftChars="0" w:firstLine="708" w:firstLineChars="0"/>
+        <w:rPr>
+          <w:rFonts w:hint="default" w:ascii="Times New Roman" w:hAnsi="Times New Roman" w:cs="Times New Roman"/>
+          <w:sz w:val="24"/>
+          <w:szCs w:val="24"/>
+        </w:rPr>
+      </w:pPr>
+      <w:r>
+        <w:rPr>
+          <w:rFonts w:hint="default" w:ascii="Times New Roman" w:hAnsi="Times New Roman" w:cs="Times New Roman"/>
+          <w:sz w:val="24"/>
+          <w:szCs w:val="24"/>
+        </w:rPr>
+        <w:t>Echéance TTC                                                   </w:t>
+      </w:r>
+      <w:r>
+        <w:rPr>
+          <w:rFonts w:hint="default" w:ascii="Times New Roman" w:hAnsi="Times New Roman" w:cs="Times New Roman"/>
+          <w:sz w:val="24"/>
+          <w:szCs w:val="24"/>
+          <w:lang w:val="en-US"/>
+        </w:rPr>
+        <w:tab/>
+      </w:r>
+      <w:r>
+        <w:rPr>
+          <w:rFonts w:hint="default" w:ascii="Times New Roman" w:hAnsi="Times New Roman" w:cs="Times New Roman"/>
+          <w:sz w:val="24"/>
+          <w:szCs w:val="24"/>
+        </w:rPr>
+        <w:t xml:space="preserve">: </w:t>
+      </w:r>
+      <w:r>
+        <w:rPr>
+          <w:rFonts w:hint="default" w:ascii="Times New Roman" w:hAnsi="Times New Roman" w:cs="Times New Roman"/>
+          <w:sz w:val="24"/>
+          <w:szCs w:val="24"/>
+          <w:lang w:val="en-US"/>
+        </w:rPr>
+        <w:t>${due_amount}</w:t>
+      </w:r>
+      <w:r>
+        <w:rPr>
+          <w:rFonts w:hint="default" w:ascii="Times New Roman" w:hAnsi="Times New Roman" w:cs="Times New Roman"/>
+          <w:sz w:val="24"/>
+          <w:szCs w:val="24"/>
+        </w:rPr>
+        <w:t xml:space="preserve"> FCFA</w:t>
+      </w:r>
+    </w:p>
+    <w:p>
+      <w:pPr>
+        <w:pStyle w:val="10"/>
+        <w:numPr>
+          <w:numId w:val="0"/>
+        </w:numPr>
+        <w:ind w:leftChars="0" w:firstLine="708" w:firstLineChars="0"/>
+        <w:rPr>
+          <w:rFonts w:hint="default" w:ascii="Times New Roman" w:hAnsi="Times New Roman" w:cs="Times New Roman"/>
+          <w:sz w:val="24"/>
+          <w:szCs w:val="24"/>
+        </w:rPr>
+      </w:pPr>
+      <w:r>
+        <w:rPr>
+          <w:rFonts w:hint="default" w:ascii="Times New Roman" w:hAnsi="Times New Roman" w:cs="Times New Roman"/>
+          <w:sz w:val="24"/>
+          <w:szCs w:val="24"/>
+        </w:rPr>
+        <w:t>Frais de dossier</w:t>
+      </w:r>
+      <w:r>
+        <w:rPr>
+          <w:rFonts w:hint="default" w:ascii="Times New Roman" w:hAnsi="Times New Roman" w:cs="Times New Roman"/>
+          <w:sz w:val="24"/>
+          <w:szCs w:val="24"/>
+          <w:lang w:val="en-US"/>
+        </w:rPr>
+        <w:t xml:space="preserve"> Hors Taxe</w:t>
+      </w:r>
+      <w:r>
+        <w:rPr>
+          <w:rFonts w:hint="default" w:ascii="Times New Roman" w:hAnsi="Times New Roman" w:cs="Times New Roman"/>
+          <w:sz w:val="24"/>
+          <w:szCs w:val="24"/>
+        </w:rPr>
+        <w:t>(</w:t>
+      </w:r>
+      <w:r>
+        <w:rPr>
+          <w:rFonts w:hint="default" w:ascii="Times New Roman" w:hAnsi="Times New Roman" w:cs="Times New Roman"/>
+          <w:sz w:val="24"/>
+          <w:szCs w:val="24"/>
+          <w:lang w:val="en-US"/>
+        </w:rPr>
+        <w:t>${administrative_fees_percentage}</w:t>
+      </w:r>
+      <w:r>
+        <w:rPr>
+          <w:rFonts w:hint="default" w:ascii="Times New Roman" w:hAnsi="Times New Roman" w:cs="Times New Roman"/>
+          <w:sz w:val="24"/>
+          <w:szCs w:val="24"/>
+        </w:rPr>
+        <w:t>%)</w:t>
+      </w:r>
+      <w:r>
+        <w:rPr>
+          <w:rFonts w:hint="default" w:ascii="Times New Roman" w:hAnsi="Times New Roman" w:cs="Times New Roman"/>
+          <w:sz w:val="24"/>
+          <w:szCs w:val="24"/>
+          <w:lang w:val="en-US"/>
+        </w:rPr>
+        <w:tab/>
+      </w:r>
+      <w:r>
+        <w:rPr>
+          <w:rFonts w:hint="default" w:ascii="Times New Roman" w:hAnsi="Times New Roman" w:cs="Times New Roman"/>
+          <w:sz w:val="24"/>
+          <w:szCs w:val="24"/>
+          <w:lang w:val="en-US"/>
+        </w:rPr>
+        <w:tab/>
+      </w:r>
+      <w:r>
+        <w:rPr>
+          <w:rFonts w:hint="default" w:ascii="Times New Roman" w:hAnsi="Times New Roman" w:cs="Times New Roman"/>
+          <w:sz w:val="24"/>
+          <w:szCs w:val="24"/>
+          <w:lang w:val="en-US"/>
+        </w:rPr>
+        <w:t>: ${administrative_fees_percentage.value}</w:t>
+      </w:r>
+      <w:r>
+        <w:rPr>
+          <w:rFonts w:hint="default" w:ascii="Times New Roman" w:hAnsi="Times New Roman" w:cs="Times New Roman"/>
+          <w:sz w:val="24"/>
+          <w:szCs w:val="24"/>
+        </w:rPr>
+        <w:t xml:space="preserve"> F CFA</w:t>
+      </w:r>
+    </w:p>
+    <w:p>
+      <w:pPr>
+        <w:pStyle w:val="10"/>
+        <w:numPr>
+          <w:numId w:val="0"/>
+        </w:numPr>
+        <w:ind w:leftChars="0" w:firstLine="708" w:firstLineChars="0"/>
+        <w:rPr>
+          <w:rFonts w:hint="default" w:ascii="Times New Roman" w:hAnsi="Times New Roman" w:cs="Times New Roman"/>
+          <w:sz w:val="24"/>
+          <w:szCs w:val="24"/>
+        </w:rPr>
+      </w:pPr>
+      <w:r>
+        <w:rPr>
+          <w:rFonts w:hint="default" w:ascii="Times New Roman" w:hAnsi="Times New Roman" w:cs="Times New Roman"/>
+          <w:sz w:val="24"/>
+          <w:szCs w:val="24"/>
+        </w:rPr>
+        <w:t xml:space="preserve">Prime d’assurance                                             </w:t>
+      </w:r>
+      <w:r>
+        <w:rPr>
+          <w:rFonts w:hint="default" w:ascii="Times New Roman" w:hAnsi="Times New Roman" w:cs="Times New Roman"/>
+          <w:sz w:val="24"/>
+          <w:szCs w:val="24"/>
+          <w:lang w:val="en-US"/>
+        </w:rPr>
+        <w:tab/>
+      </w:r>
+      <w:r>
+        <w:rPr>
+          <w:rFonts w:hint="default" w:ascii="Times New Roman" w:hAnsi="Times New Roman" w:cs="Times New Roman"/>
+          <w:sz w:val="24"/>
+          <w:szCs w:val="24"/>
+        </w:rPr>
+        <w:t xml:space="preserve">: </w:t>
+      </w:r>
+      <w:r>
+        <w:rPr>
+          <w:rFonts w:hint="default" w:ascii="Times New Roman" w:hAnsi="Times New Roman" w:cs="Times New Roman"/>
+          <w:sz w:val="24"/>
+          <w:szCs w:val="24"/>
+          <w:lang w:val="en-US"/>
+        </w:rPr>
+        <w:t>${insurance_premium} F CFA</w:t>
+      </w:r>
+    </w:p>
+    <w:p>
+      <w:pPr>
+        <w:pStyle w:val="10"/>
+        <w:numPr>
+          <w:numId w:val="0"/>
+        </w:numPr>
+        <w:ind w:leftChars="0" w:firstLine="708" w:firstLineChars="0"/>
+        <w:rPr>
+          <w:rFonts w:hint="default" w:ascii="Times New Roman" w:hAnsi="Times New Roman" w:cs="Times New Roman"/>
+          <w:sz w:val="24"/>
+          <w:szCs w:val="24"/>
+        </w:rPr>
+      </w:pPr>
+      <w:bookmarkStart w:id="3" w:name="_GoBack"/>
+      <w:bookmarkEnd w:id="3"/>
+      <w:r>
+        <w:rPr>
+          <w:rFonts w:hint="default" w:ascii="Times New Roman" w:hAnsi="Times New Roman" w:cs="Times New Roman"/>
+          <w:b w:val="0"/>
+          <w:bCs/>
+          <w:shd w:val="clear" w:fill="auto"/>
+          <w:lang w:val="en-US"/>
+        </w:rPr>
+        <w:t>${line_review_bonus}</w:t>
+      </w:r>
+      <w:r>
+        <w:rPr>
+          <w:rFonts w:hint="default" w:ascii="Times New Roman" w:hAnsi="Times New Roman" w:cs="Times New Roman"/>
+          <w:sz w:val="24"/>
+          <w:szCs w:val="24"/>
+        </w:rPr>
+        <w:t xml:space="preserve"> </w:t>
+      </w:r>
+    </w:p>
+    <w:p>
+      <w:pPr>
+        <w:pStyle w:val="10"/>
+        <w:ind w:left="360"/>
+        <w:rPr>
+          <w:rFonts w:hint="default" w:ascii="Times New Roman" w:hAnsi="Times New Roman" w:cs="Times New Roman"/>
+          <w:sz w:val="24"/>
+          <w:szCs w:val="24"/>
+        </w:rPr>
+      </w:pPr>
+    </w:p>
+    <w:p>
+      <w:pPr>
+        <w:ind w:right="57"/>
+        <w:jc w:val="both"/>
+        <w:rPr>
+          <w:rFonts w:hint="default" w:ascii="Times New Roman" w:hAnsi="Times New Roman" w:eastAsia="Times New Roman" w:cs="Times New Roman"/>
+          <w:b/>
+          <w:bCs/>
+          <w:sz w:val="24"/>
+          <w:szCs w:val="24"/>
+          <w:u w:val="single"/>
+        </w:rPr>
+      </w:pPr>
+      <w:r>
+        <w:rPr>
+          <w:rFonts w:hint="default" w:ascii="Times New Roman" w:hAnsi="Times New Roman" w:eastAsia="Times New Roman" w:cs="Times New Roman"/>
+          <w:b/>
+          <w:bCs/>
+          <w:sz w:val="24"/>
+          <w:szCs w:val="24"/>
+          <w:u w:val="single"/>
+        </w:rPr>
+        <w:t>GARANTIES A RECUEILLIR :</w:t>
+      </w:r>
+    </w:p>
+    <w:p>
+      <w:pPr>
+        <w:ind w:right="57"/>
+        <w:jc w:val="both"/>
+        <w:rPr>
+          <w:rFonts w:hint="default" w:ascii="Times New Roman" w:hAnsi="Times New Roman" w:eastAsia="Times New Roman" w:cs="Times New Roman"/>
+          <w:b/>
+          <w:bCs/>
+          <w:sz w:val="24"/>
+          <w:szCs w:val="24"/>
+          <w:u w:val="single"/>
+        </w:rPr>
+      </w:pPr>
+    </w:p>
+    <w:p>
+      <w:pPr>
+        <w:spacing w:line="240" w:lineRule="auto"/>
+        <w:jc w:val="both"/>
+        <w:rPr>
+          <w:rFonts w:hint="default" w:ascii="Times New Roman" w:hAnsi="Times New Roman" w:cs="Times New Roman"/>
+          <w:sz w:val="24"/>
+          <w:szCs w:val="24"/>
+        </w:rPr>
+      </w:pPr>
+      <w:r>
+        <w:rPr>
+          <w:rFonts w:hint="default" w:ascii="Times New Roman" w:hAnsi="Times New Roman" w:cs="Times New Roman"/>
+          <w:sz w:val="24"/>
+          <w:szCs w:val="24"/>
+        </w:rPr>
+        <w:t>${guaranteeList}</w:t>
+      </w:r>
+    </w:p>
+    <w:p>
+      <w:pPr>
         <w:numPr>
           <w:ilvl w:val="0"/>
           <w:numId w:val="1"/>
-        </w:numPr>
-        <w:rPr>
-          <w:rFonts w:hint="default" w:ascii="Times New Roman" w:hAnsi="Times New Roman" w:cs="Times New Roman"/>
-          <w:sz w:val="24"/>
-          <w:szCs w:val="24"/>
-        </w:rPr>
-      </w:pPr>
-      <w:r>
-        <w:rPr>
-          <w:rFonts w:hint="default" w:ascii="Times New Roman" w:hAnsi="Times New Roman" w:cs="Times New Roman"/>
-          <w:sz w:val="24"/>
-          <w:szCs w:val="24"/>
-        </w:rPr>
-        <w:t>Durée                                                                 </w:t>
-      </w:r>
-      <w:r>
-        <w:rPr>
-          <w:rFonts w:hint="default" w:ascii="Times New Roman" w:hAnsi="Times New Roman" w:cs="Times New Roman"/>
-          <w:sz w:val="24"/>
-          <w:szCs w:val="24"/>
-          <w:lang w:val="en-US"/>
-        </w:rPr>
-        <w:tab/>
-      </w:r>
-      <w:r>
-        <w:rPr>
-          <w:rFonts w:hint="default" w:ascii="Times New Roman" w:hAnsi="Times New Roman" w:cs="Times New Roman"/>
-          <w:sz w:val="24"/>
-          <w:szCs w:val="24"/>
-        </w:rPr>
-        <w:t xml:space="preserve">: </w:t>
-      </w:r>
-      <w:r>
-        <w:rPr>
-          <w:rFonts w:hint="default" w:ascii="Times New Roman" w:hAnsi="Times New Roman" w:cs="Times New Roman"/>
-          <w:sz w:val="24"/>
-          <w:szCs w:val="24"/>
-          <w:lang w:val="en-US"/>
-        </w:rPr>
-        <w:t>${duration}</w:t>
-      </w:r>
-      <w:r>
-        <w:rPr>
-          <w:rFonts w:hint="default" w:ascii="Times New Roman" w:hAnsi="Times New Roman" w:cs="Times New Roman"/>
-          <w:sz w:val="24"/>
-          <w:szCs w:val="24"/>
-        </w:rPr>
-        <w:t xml:space="preserve"> mois   </w:t>
-      </w:r>
-    </w:p>
-    <w:p>
-      <w:pPr>
-        <w:pStyle w:val="10"/>
-        <w:numPr>
-          <w:ilvl w:val="0"/>
-          <w:numId w:val="1"/>
-        </w:numPr>
-        <w:rPr>
-          <w:rFonts w:hint="default" w:ascii="Times New Roman" w:hAnsi="Times New Roman" w:cs="Times New Roman"/>
-          <w:sz w:val="24"/>
-          <w:szCs w:val="24"/>
-        </w:rPr>
-      </w:pPr>
-      <w:r>
-        <w:rPr>
-          <w:rFonts w:hint="default" w:ascii="Times New Roman" w:hAnsi="Times New Roman" w:cs="Times New Roman"/>
-          <w:sz w:val="24"/>
-          <w:szCs w:val="24"/>
-        </w:rPr>
-        <w:t>Périodicité                                                          </w:t>
-      </w:r>
-      <w:r>
-        <w:rPr>
-          <w:rFonts w:hint="default" w:ascii="Times New Roman" w:hAnsi="Times New Roman" w:cs="Times New Roman"/>
-          <w:sz w:val="24"/>
-          <w:szCs w:val="24"/>
-          <w:lang w:val="en-US"/>
-        </w:rPr>
-        <w:tab/>
-      </w:r>
-      <w:r>
-        <w:rPr>
-          <w:rFonts w:hint="default" w:ascii="Times New Roman" w:hAnsi="Times New Roman" w:cs="Times New Roman"/>
-          <w:sz w:val="24"/>
-          <w:szCs w:val="24"/>
-        </w:rPr>
-        <w:t xml:space="preserve">: </w:t>
-      </w:r>
-      <w:r>
-        <w:rPr>
-          <w:rFonts w:hint="default" w:ascii="Times New Roman" w:hAnsi="Times New Roman" w:cs="Times New Roman"/>
-          <w:sz w:val="24"/>
-          <w:szCs w:val="24"/>
-          <w:lang w:val="en-US"/>
-        </w:rPr>
-        <w:t>${periodicity.fr}</w:t>
-      </w:r>
-    </w:p>
-    <w:p>
-      <w:pPr>
-        <w:pStyle w:val="10"/>
-        <w:numPr>
-          <w:ilvl w:val="0"/>
-          <w:numId w:val="1"/>
-        </w:numPr>
-        <w:rPr>
-          <w:rFonts w:hint="default" w:ascii="Times New Roman" w:hAnsi="Times New Roman" w:cs="Times New Roman"/>
-          <w:sz w:val="24"/>
-          <w:szCs w:val="24"/>
-        </w:rPr>
-      </w:pPr>
-      <w:r>
-        <w:rPr>
-          <w:rFonts w:hint="default" w:ascii="Times New Roman" w:hAnsi="Times New Roman" w:cs="Times New Roman"/>
-          <w:sz w:val="24"/>
-          <w:szCs w:val="24"/>
-        </w:rPr>
-        <w:t>Taux d’Intérêt HT                                             </w:t>
-      </w:r>
-      <w:r>
-        <w:rPr>
-          <w:rFonts w:hint="default" w:ascii="Times New Roman" w:hAnsi="Times New Roman" w:cs="Times New Roman"/>
-          <w:sz w:val="24"/>
-          <w:szCs w:val="24"/>
-          <w:lang w:val="en-US"/>
-        </w:rPr>
-        <w:tab/>
-      </w:r>
-      <w:r>
-        <w:rPr>
-          <w:rFonts w:hint="default" w:ascii="Times New Roman" w:hAnsi="Times New Roman" w:cs="Times New Roman"/>
-          <w:sz w:val="24"/>
-          <w:szCs w:val="24"/>
-        </w:rPr>
-        <w:t xml:space="preserve">: </w:t>
-      </w:r>
-      <w:r>
-        <w:rPr>
-          <w:rFonts w:hint="default" w:ascii="Times New Roman" w:hAnsi="Times New Roman" w:cs="Times New Roman"/>
-          <w:sz w:val="24"/>
-          <w:szCs w:val="24"/>
-          <w:lang w:val="en-US"/>
-        </w:rPr>
-        <w:t>${tax_fee_interest_rate}</w:t>
-      </w:r>
-      <w:r>
-        <w:rPr>
-          <w:rFonts w:hint="default" w:ascii="Times New Roman" w:hAnsi="Times New Roman" w:cs="Times New Roman"/>
-          <w:sz w:val="24"/>
-          <w:szCs w:val="24"/>
-        </w:rPr>
-        <w:t>%</w:t>
-      </w:r>
-    </w:p>
-    <w:p>
-      <w:pPr>
-        <w:pStyle w:val="10"/>
-        <w:numPr>
-          <w:ilvl w:val="0"/>
-          <w:numId w:val="1"/>
-        </w:numPr>
-        <w:rPr>
-          <w:rFonts w:hint="default" w:ascii="Times New Roman" w:hAnsi="Times New Roman" w:cs="Times New Roman"/>
-          <w:sz w:val="24"/>
-          <w:szCs w:val="24"/>
-        </w:rPr>
-      </w:pPr>
-      <w:r>
-        <w:rPr>
-          <w:rFonts w:hint="default" w:ascii="Times New Roman" w:hAnsi="Times New Roman" w:cs="Times New Roman"/>
-          <w:sz w:val="24"/>
-          <w:szCs w:val="24"/>
-        </w:rPr>
-        <w:t>TAF                                                                   </w:t>
-      </w:r>
-      <w:r>
-        <w:rPr>
-          <w:rFonts w:hint="default" w:ascii="Times New Roman" w:hAnsi="Times New Roman" w:cs="Times New Roman"/>
-          <w:sz w:val="24"/>
-          <w:szCs w:val="24"/>
-          <w:lang w:val="en-US"/>
-        </w:rPr>
-        <w:tab/>
-      </w:r>
-      <w:r>
-        <w:rPr>
-          <w:rFonts w:hint="default" w:ascii="Times New Roman" w:hAnsi="Times New Roman" w:cs="Times New Roman"/>
-          <w:sz w:val="24"/>
-          <w:szCs w:val="24"/>
-        </w:rPr>
-        <w:t xml:space="preserve">: </w:t>
-      </w:r>
-      <w:r>
-        <w:rPr>
-          <w:rFonts w:hint="default" w:ascii="Times New Roman" w:hAnsi="Times New Roman" w:cs="Times New Roman"/>
-          <w:sz w:val="24"/>
-          <w:szCs w:val="24"/>
-          <w:lang w:val="en-US"/>
-        </w:rPr>
-        <w:t>${taf}</w:t>
-      </w:r>
-      <w:r>
-        <w:rPr>
-          <w:rFonts w:hint="default" w:ascii="Times New Roman" w:hAnsi="Times New Roman" w:cs="Times New Roman"/>
-          <w:sz w:val="24"/>
-          <w:szCs w:val="24"/>
-        </w:rPr>
-        <w:t>%</w:t>
-      </w:r>
-    </w:p>
-    <w:p>
-      <w:pPr>
-        <w:pStyle w:val="10"/>
-        <w:numPr>
-          <w:ilvl w:val="0"/>
-          <w:numId w:val="1"/>
-        </w:numPr>
-        <w:rPr>
-          <w:rFonts w:hint="default" w:ascii="Times New Roman" w:hAnsi="Times New Roman" w:cs="Times New Roman"/>
-          <w:sz w:val="24"/>
-          <w:szCs w:val="24"/>
-        </w:rPr>
-      </w:pPr>
-      <w:r>
-        <w:rPr>
-          <w:rFonts w:hint="default" w:ascii="Times New Roman" w:hAnsi="Times New Roman" w:cs="Times New Roman"/>
-          <w:sz w:val="24"/>
-          <w:szCs w:val="24"/>
-        </w:rPr>
-        <w:t>Echéance TTC                                                   </w:t>
-      </w:r>
-      <w:r>
-        <w:rPr>
-          <w:rFonts w:hint="default" w:ascii="Times New Roman" w:hAnsi="Times New Roman" w:cs="Times New Roman"/>
-          <w:sz w:val="24"/>
-          <w:szCs w:val="24"/>
-          <w:lang w:val="en-US"/>
-        </w:rPr>
-        <w:tab/>
-      </w:r>
-      <w:r>
-        <w:rPr>
-          <w:rFonts w:hint="default" w:ascii="Times New Roman" w:hAnsi="Times New Roman" w:cs="Times New Roman"/>
-          <w:sz w:val="24"/>
-          <w:szCs w:val="24"/>
-        </w:rPr>
-        <w:t xml:space="preserve">: </w:t>
-      </w:r>
-      <w:r>
-        <w:rPr>
-          <w:rFonts w:hint="default" w:ascii="Times New Roman" w:hAnsi="Times New Roman" w:cs="Times New Roman"/>
-          <w:sz w:val="24"/>
-          <w:szCs w:val="24"/>
-          <w:lang w:val="en-US"/>
-        </w:rPr>
-        <w:t>${due_amount}</w:t>
-      </w:r>
-      <w:r>
-        <w:rPr>
-          <w:rFonts w:hint="default" w:ascii="Times New Roman" w:hAnsi="Times New Roman" w:cs="Times New Roman"/>
-          <w:sz w:val="24"/>
-          <w:szCs w:val="24"/>
-        </w:rPr>
-        <w:t xml:space="preserve"> FCFA</w:t>
-      </w:r>
-    </w:p>
-    <w:p>
-      <w:pPr>
-        <w:pStyle w:val="10"/>
-        <w:numPr>
-          <w:ilvl w:val="0"/>
-          <w:numId w:val="1"/>
-        </w:numPr>
-        <w:rPr>
-          <w:rFonts w:hint="default" w:ascii="Times New Roman" w:hAnsi="Times New Roman" w:cs="Times New Roman"/>
-          <w:sz w:val="24"/>
-          <w:szCs w:val="24"/>
-        </w:rPr>
-      </w:pPr>
-      <w:r>
-        <w:rPr>
-          <w:rFonts w:hint="default" w:ascii="Times New Roman" w:hAnsi="Times New Roman" w:cs="Times New Roman"/>
-          <w:sz w:val="24"/>
-          <w:szCs w:val="24"/>
-        </w:rPr>
-        <w:t>Frais de dossier(</w:t>
-      </w:r>
-      <w:r>
-        <w:rPr>
-          <w:rFonts w:hint="default" w:ascii="Times New Roman" w:hAnsi="Times New Roman" w:cs="Times New Roman"/>
-          <w:sz w:val="24"/>
-          <w:szCs w:val="24"/>
-          <w:lang w:val="en-US"/>
-        </w:rPr>
-        <w:t>${administrative_fees_percentage}</w:t>
-      </w:r>
-      <w:r>
-        <w:rPr>
-          <w:rFonts w:hint="default" w:ascii="Times New Roman" w:hAnsi="Times New Roman" w:cs="Times New Roman"/>
-          <w:sz w:val="24"/>
-          <w:szCs w:val="24"/>
-        </w:rPr>
-        <w:t>%):</w:t>
-      </w:r>
-      <w:r>
-        <w:rPr>
-          <w:rFonts w:hint="default" w:ascii="Times New Roman" w:hAnsi="Times New Roman" w:cs="Times New Roman"/>
-          <w:sz w:val="24"/>
-          <w:szCs w:val="24"/>
-          <w:lang w:val="en-US"/>
-        </w:rPr>
-        <w:tab/>
-      </w:r>
-      <w:r>
-        <w:rPr>
-          <w:rFonts w:hint="default" w:ascii="Times New Roman" w:hAnsi="Times New Roman" w:cs="Times New Roman"/>
-          <w:sz w:val="24"/>
-          <w:szCs w:val="24"/>
-          <w:lang w:val="en-US"/>
-        </w:rPr>
-        <w:tab/>
-      </w:r>
-      <w:r>
-        <w:rPr>
-          <w:rFonts w:hint="default" w:ascii="Times New Roman" w:hAnsi="Times New Roman" w:cs="Times New Roman"/>
-          <w:sz w:val="24"/>
-          <w:szCs w:val="24"/>
-          <w:lang w:val="en-US"/>
-        </w:rPr>
-        <w:tab/>
-      </w:r>
-      <w:r>
-        <w:rPr>
-          <w:rFonts w:hint="default" w:ascii="Times New Roman" w:hAnsi="Times New Roman" w:cs="Times New Roman"/>
-          <w:sz w:val="24"/>
-          <w:szCs w:val="24"/>
-          <w:lang w:val="en-US"/>
-        </w:rPr>
-        <w:tab/>
-      </w:r>
-      <w:r>
-        <w:rPr>
-          <w:rFonts w:hint="default" w:ascii="Times New Roman" w:hAnsi="Times New Roman" w:cs="Times New Roman"/>
-          <w:sz w:val="24"/>
-          <w:szCs w:val="24"/>
-          <w:lang w:val="en-US"/>
-        </w:rPr>
-        <w:t>: ${administrative_fees_percentage.value}</w:t>
-      </w:r>
-      <w:r>
-        <w:rPr>
-          <w:rFonts w:hint="default" w:ascii="Times New Roman" w:hAnsi="Times New Roman" w:cs="Times New Roman"/>
-          <w:sz w:val="24"/>
-          <w:szCs w:val="24"/>
-        </w:rPr>
-        <w:t xml:space="preserve"> F CFA</w:t>
-      </w:r>
-    </w:p>
-    <w:p>
-      <w:pPr>
-        <w:pStyle w:val="10"/>
-        <w:numPr>
-          <w:ilvl w:val="0"/>
-          <w:numId w:val="1"/>
-        </w:numPr>
-        <w:rPr>
-          <w:rFonts w:hint="default" w:ascii="Times New Roman" w:hAnsi="Times New Roman" w:cs="Times New Roman"/>
-          <w:sz w:val="24"/>
-          <w:szCs w:val="24"/>
-        </w:rPr>
-      </w:pPr>
-      <w:r>
-        <w:rPr>
-          <w:rFonts w:hint="default" w:ascii="Times New Roman" w:hAnsi="Times New Roman" w:cs="Times New Roman"/>
-          <w:sz w:val="24"/>
-          <w:szCs w:val="24"/>
-        </w:rPr>
-        <w:t xml:space="preserve">Prime d’assurance                                             </w:t>
-      </w:r>
-      <w:r>
-        <w:rPr>
-          <w:rFonts w:hint="default" w:ascii="Times New Roman" w:hAnsi="Times New Roman" w:cs="Times New Roman"/>
-          <w:sz w:val="24"/>
-          <w:szCs w:val="24"/>
-          <w:lang w:val="en-US"/>
-        </w:rPr>
-        <w:tab/>
-      </w:r>
-      <w:r>
-        <w:rPr>
-          <w:rFonts w:hint="default" w:ascii="Times New Roman" w:hAnsi="Times New Roman" w:cs="Times New Roman"/>
-          <w:sz w:val="24"/>
-          <w:szCs w:val="24"/>
-        </w:rPr>
-        <w:t xml:space="preserve">: </w:t>
-      </w:r>
-      <w:r>
-        <w:rPr>
-          <w:rFonts w:hint="default" w:ascii="Times New Roman" w:hAnsi="Times New Roman" w:cs="Times New Roman"/>
-          <w:sz w:val="24"/>
-          <w:szCs w:val="24"/>
-          <w:lang w:val="en-US"/>
-        </w:rPr>
-        <w:t>${insurance_premium} F CFA</w:t>
-      </w:r>
-      <w:bookmarkStart w:id="3" w:name="_GoBack"/>
-      <w:bookmarkEnd w:id="3"/>
-    </w:p>
-    <w:p>
-      <w:pPr>
-        <w:pStyle w:val="10"/>
-        <w:numPr>
-          <w:ilvl w:val="0"/>
-          <w:numId w:val="1"/>
-        </w:numPr>
-        <w:rPr>
-          <w:rFonts w:hint="default" w:ascii="Times New Roman" w:hAnsi="Times New Roman" w:cs="Times New Roman"/>
-          <w:sz w:val="24"/>
-          <w:szCs w:val="24"/>
-        </w:rPr>
-      </w:pPr>
-      <w:r>
-        <w:rPr>
-          <w:rFonts w:hint="default" w:ascii="Times New Roman" w:hAnsi="Times New Roman" w:cs="Times New Roman"/>
-          <w:b w:val="0"/>
-          <w:bCs/>
-          <w:shd w:val="clear" w:fill="auto"/>
-          <w:lang w:val="en-US"/>
-        </w:rPr>
-        <w:t>${line_review_bonus}</w:t>
-      </w:r>
-      <w:r>
-        <w:rPr>
-          <w:rFonts w:hint="default" w:ascii="Times New Roman" w:hAnsi="Times New Roman" w:cs="Times New Roman"/>
-          <w:sz w:val="24"/>
-          <w:szCs w:val="24"/>
-        </w:rPr>
-        <w:t xml:space="preserve"> </w:t>
-      </w:r>
-    </w:p>
-    <w:p>
-      <w:pPr>
-        <w:pStyle w:val="10"/>
-        <w:ind w:left="360"/>
-        <w:rPr>
-          <w:rFonts w:hint="default" w:ascii="Times New Roman" w:hAnsi="Times New Roman" w:cs="Times New Roman"/>
-          <w:sz w:val="24"/>
-          <w:szCs w:val="24"/>
-        </w:rPr>
-      </w:pPr>
-    </w:p>
-    <w:p>
-      <w:pPr>
-        <w:ind w:right="57"/>
-        <w:jc w:val="both"/>
-        <w:rPr>
-          <w:rFonts w:hint="default" w:ascii="Times New Roman" w:hAnsi="Times New Roman" w:eastAsia="Times New Roman" w:cs="Times New Roman"/>
-          <w:b/>
-          <w:bCs/>
-          <w:sz w:val="24"/>
-          <w:szCs w:val="24"/>
-          <w:u w:val="single"/>
-        </w:rPr>
-      </w:pPr>
-      <w:r>
-        <w:rPr>
-          <w:rFonts w:hint="default" w:ascii="Times New Roman" w:hAnsi="Times New Roman" w:eastAsia="Times New Roman" w:cs="Times New Roman"/>
-          <w:b/>
-          <w:bCs/>
-          <w:sz w:val="24"/>
-          <w:szCs w:val="24"/>
-          <w:u w:val="single"/>
-        </w:rPr>
-        <w:t>GARANTIES A RECUEILLIR :</w:t>
-      </w:r>
-    </w:p>
-    <w:p>
-      <w:pPr>
-        <w:ind w:right="57"/>
-        <w:jc w:val="both"/>
-        <w:rPr>
-          <w:rFonts w:hint="default" w:ascii="Times New Roman" w:hAnsi="Times New Roman" w:eastAsia="Times New Roman" w:cs="Times New Roman"/>
-          <w:b/>
-          <w:bCs/>
-          <w:sz w:val="24"/>
-          <w:szCs w:val="24"/>
-          <w:u w:val="single"/>
-        </w:rPr>
-      </w:pPr>
-    </w:p>
-    <w:p>
-      <w:pPr>
-        <w:spacing w:line="240" w:lineRule="auto"/>
-        <w:jc w:val="both"/>
-        <w:rPr>
-          <w:rFonts w:hint="default" w:ascii="Times New Roman" w:hAnsi="Times New Roman" w:cs="Times New Roman"/>
-          <w:sz w:val="24"/>
-          <w:szCs w:val="24"/>
-        </w:rPr>
-      </w:pPr>
-      <w:r>
-        <w:rPr>
-          <w:rFonts w:hint="default" w:ascii="Times New Roman" w:hAnsi="Times New Roman" w:cs="Times New Roman"/>
-          <w:sz w:val="24"/>
-          <w:szCs w:val="24"/>
-        </w:rPr>
-        <w:t>${guaranteeList}</w:t>
-      </w:r>
-    </w:p>
-    <w:p>
-      <w:pPr>
-        <w:numPr>
-          <w:ilvl w:val="0"/>
-          <w:numId w:val="2"/>
         </w:numPr>
         <w:spacing w:line="240" w:lineRule="auto"/>
         <w:jc w:val="both"/>
@@ -1363,101 +1362,7 @@
       </w:pPr>
     </w:lvl>
   </w:abstractNum>
-  <w:abstractNum w:abstractNumId="1">
-    <w:nsid w:val="2B395A10"/>
-    <w:multiLevelType w:val="multilevel"/>
-    <w:tmpl w:val="2B395A10"/>
-    <w:lvl w:ilvl="0" w:tentative="0">
-      <w:start w:val="1"/>
-      <w:numFmt w:val="bullet"/>
-      <w:lvlText w:val=""/>
-      <w:lvlJc w:val="left"/>
-      <w:pPr>
-        <w:ind w:left="360" w:hanging="360"/>
-      </w:pPr>
-      <w:rPr>
-        <w:rFonts w:hint="default" w:ascii="Symbol" w:hAnsi="Symbol"/>
-        <w:b w:val="0"/>
-        <w:bCs w:val="0"/>
-      </w:rPr>
-    </w:lvl>
-    <w:lvl w:ilvl="1" w:tentative="0">
-      <w:start w:val="1"/>
-      <w:numFmt w:val="lowerLetter"/>
-      <w:lvlText w:val="%2."/>
-      <w:lvlJc w:val="left"/>
-      <w:pPr>
-        <w:ind w:left="1440" w:hanging="360"/>
-      </w:pPr>
-    </w:lvl>
-    <w:lvl w:ilvl="2" w:tentative="0">
-      <w:start w:val="1"/>
-      <w:numFmt w:val="lowerRoman"/>
-      <w:lvlText w:val="%3."/>
-      <w:lvlJc w:val="right"/>
-      <w:pPr>
-        <w:ind w:left="2160" w:hanging="180"/>
-      </w:pPr>
-    </w:lvl>
-    <w:lvl w:ilvl="3" w:tentative="0">
-      <w:start w:val="1"/>
-      <w:numFmt w:val="decimal"/>
-      <w:lvlText w:val="%4."/>
-      <w:lvlJc w:val="left"/>
-      <w:pPr>
-        <w:ind w:left="2880" w:hanging="360"/>
-      </w:pPr>
-    </w:lvl>
-    <w:lvl w:ilvl="4" w:tentative="0">
-      <w:start w:val="1"/>
-      <w:numFmt w:val="lowerLetter"/>
-      <w:lvlText w:val="%5."/>
-      <w:lvlJc w:val="left"/>
-      <w:pPr>
-        <w:ind w:left="3600" w:hanging="360"/>
-      </w:pPr>
-    </w:lvl>
-    <w:lvl w:ilvl="5" w:tentative="0">
-      <w:start w:val="1"/>
-      <w:numFmt w:val="lowerRoman"/>
-      <w:lvlText w:val="%6."/>
-      <w:lvlJc w:val="right"/>
-      <w:pPr>
-        <w:ind w:left="4320" w:hanging="180"/>
-      </w:pPr>
-    </w:lvl>
-    <w:lvl w:ilvl="6" w:tentative="0">
-      <w:start w:val="1"/>
-      <w:numFmt w:val="decimal"/>
-      <w:lvlText w:val="%7."/>
-      <w:lvlJc w:val="left"/>
-      <w:pPr>
-        <w:ind w:left="5040" w:hanging="360"/>
-      </w:pPr>
-    </w:lvl>
-    <w:lvl w:ilvl="7" w:tentative="0">
-      <w:start w:val="1"/>
-      <w:numFmt w:val="lowerLetter"/>
-      <w:lvlText w:val="%8."/>
-      <w:lvlJc w:val="left"/>
-      <w:pPr>
-        <w:ind w:left="5760" w:hanging="360"/>
-      </w:pPr>
-    </w:lvl>
-    <w:lvl w:ilvl="8" w:tentative="0">
-      <w:start w:val="1"/>
-      <w:numFmt w:val="lowerRoman"/>
-      <w:lvlText w:val="%9."/>
-      <w:lvlJc w:val="right"/>
-      <w:pPr>
-        <w:ind w:left="6480" w:hanging="180"/>
-      </w:pPr>
-    </w:lvl>
-  </w:abstractNum>
   <w:num w:numId="1">
-    <w:abstractNumId w:val="1"/>
-  </w:num>
-  <w:num w:numId="2">
     <w:abstractNumId w:val="0"/>
   </w:num>
 </w:numbering>

</xml_diff>